<commit_message>
Añade el enlace del repositorio al informe, la guía y el README
Co-Authored-By: Claude Opus 5.5 <noreply@anthropic.com>
Claude-Session: https://claude.ai/code/session_01AwFSxRuifjJgrmh4pah8hw
</commit_message>
<xml_diff>
--- a/guia_PFI.docx
+++ b/guia_PFI.docx
@@ -14642,6 +14642,38 @@
     </w:p>
     <w:p>
       <w:pPr>
+        <w:spacing w:after="100" w:line="276"/>
+        <w:jc w:val="both"/>
+      </w:pPr>
+      <w:r>
+        <w:rPr>
+          <w:rFonts w:ascii="Arial Narrow" w:cs="Arial Narrow" w:eastAsia="Arial Narrow" w:hAnsi="Arial Narrow"/>
+          <w:sz w:val="22"/>
+          <w:szCs w:val="22"/>
+        </w:rPr>
+        <w:t xml:space="preserve">Repositorio público del equipo: </w:t>
+      </w:r>
+      <w:r>
+        <w:rPr>
+          <w:rFonts w:ascii="Arial Narrow" w:cs="Arial Narrow" w:eastAsia="Arial Narrow" w:hAnsi="Arial Narrow"/>
+          <w:b/>
+          <w:bCs/>
+          <w:sz w:val="22"/>
+          <w:szCs w:val="22"/>
+        </w:rPr>
+        <w:t xml:space="preserve">https://github.com/rafafajardo-ux/TRABAJO-FINAL</w:t>
+      </w:r>
+      <w:r>
+        <w:rPr>
+          <w:rFonts w:ascii="Arial Narrow" w:cs="Arial Narrow" w:eastAsia="Arial Narrow" w:hAnsi="Arial Narrow"/>
+          <w:sz w:val="22"/>
+          <w:szCs w:val="22"/>
+        </w:rPr>
+        <w:t xml:space="preserve">. Para clonarlo y abrir el aplicativo:</w:t>
+      </w:r>
+    </w:p>
+    <w:p>
+      <w:pPr>
         <w:shd w:fill="F2F2F2" w:val="clear"/>
         <w:spacing w:after="0"/>
       </w:pPr>
@@ -14651,7 +14683,7 @@
           <w:sz w:val="22"/>
           <w:szCs w:val="22"/>
         </w:rPr>
-        <w:t xml:space="preserve">git init &amp;&amp; git add . &amp;&amp; git commit -m "PFI: Reservas 1P y regalías"</w:t>
+        <w:t xml:space="preserve">git clone https://github.com/rafafajardo-ux/TRABAJO-FINAL.git</w:t>
       </w:r>
     </w:p>
     <w:p>
@@ -14665,7 +14697,7 @@
           <w:sz w:val="22"/>
           <w:szCs w:val="22"/>
         </w:rPr>
-        <w:t xml:space="preserve">git branch -M main</w:t>
+        <w:t xml:space="preserve">cd TRABAJO-FINAL</w:t>
       </w:r>
     </w:p>
     <w:p>
@@ -14679,7 +14711,7 @@
           <w:sz w:val="22"/>
           <w:szCs w:val="22"/>
         </w:rPr>
-        <w:t xml:space="preserve">git remote add origin https://github.com/&lt;usuario&gt;/&lt;repositorio&gt;.git</w:t>
+        <w:t xml:space="preserve">pip install -r requirements.txt</w:t>
       </w:r>
     </w:p>
     <w:p>
@@ -14693,7 +14725,7 @@
           <w:sz w:val="22"/>
           <w:szCs w:val="22"/>
         </w:rPr>
-        <w:t xml:space="preserve">git push -u origin main</w:t>
+        <w:t xml:space="preserve">streamlit run app/app.py</w:t>
       </w:r>
     </w:p>
     <w:p>
@@ -14713,7 +14745,7 @@
           <w:sz w:val="22"/>
           <w:szCs w:val="22"/>
         </w:rPr>
-        <w:t xml:space="preserve">Antes de entregar: pegar el enlace del repositorio en el comentario de la entrega.</w:t>
+        <w:t xml:space="preserve">En la entrega, pegar el enlace del repositorio en el comentario: https://github.com/rafafajardo-ux/TRABAJO-FINAL</w:t>
       </w:r>
     </w:p>
     <w:p>

</xml_diff>

<commit_message>
Añade el enlace del aplicativo en línea y corrige decimales en alertas
Co-Authored-By: Claude Opus 5.5 <noreply@anthropic.com>
Claude-Session: https://claude.ai/code/session_01AwFSxRuifjJgrmh4pah8hw
</commit_message>
<xml_diff>
--- a/guia_PFI.docx
+++ b/guia_PFI.docx
@@ -14742,10 +14742,34 @@
       <w:r>
         <w:rPr>
           <w:rFonts w:ascii="Arial Narrow" w:cs="Arial Narrow" w:eastAsia="Arial Narrow" w:hAnsi="Arial Narrow"/>
-          <w:sz w:val="22"/>
-          <w:szCs w:val="22"/>
-        </w:rPr>
-        <w:t xml:space="preserve">En la entrega, pegar el enlace del repositorio en el comentario: https://github.com/rafafajardo-ux/TRABAJO-FINAL</w:t>
+          <w:b/>
+          <w:bCs/>
+          <w:sz w:val="22"/>
+          <w:szCs w:val="22"/>
+        </w:rPr>
+        <w:t xml:space="preserve">Aplicativo en línea:</w:t>
+      </w:r>
+      <w:r>
+        <w:rPr>
+          <w:rFonts w:ascii="Arial Narrow" w:cs="Arial Narrow" w:eastAsia="Arial Narrow" w:hAnsi="Arial Narrow"/>
+          <w:sz w:val="22"/>
+          <w:szCs w:val="22"/>
+        </w:rPr>
+        <w:t xml:space="preserve"> https://rafafajardo-ux.github.io/TRABAJO-FINAL/. Funciona en el navegador sin instalar nada (Streamlit sobre WebAssembly con stlite, publicado en GitHub Pages): la primera carga tarda unos 30 segundos y pide los términos y la contraseña. El botón de precios de Yahoo Finance no funciona en esta versión; los precios se editan a mano.</w:t>
+      </w:r>
+    </w:p>
+    <w:p>
+      <w:pPr>
+        <w:spacing w:after="100" w:line="276"/>
+        <w:jc w:val="both"/>
+      </w:pPr>
+      <w:r>
+        <w:rPr>
+          <w:rFonts w:ascii="Arial Narrow" w:cs="Arial Narrow" w:eastAsia="Arial Narrow" w:hAnsi="Arial Narrow"/>
+          <w:sz w:val="22"/>
+          <w:szCs w:val="22"/>
+        </w:rPr>
+        <w:t xml:space="preserve">En la entrega, pegar en el comentario el enlace del repositorio (https://github.com/rafafajardo-ux/TRABAJO-FINAL) y el del aplicativo en línea.</w:t>
       </w:r>
     </w:p>
     <w:p>

</xml_diff>